<commit_message>
Update documentation files: remove outdated diagrams and add new UML diagram
</commit_message>
<xml_diff>
--- a/Docs/DA - MotoRev v2.docx
+++ b/Docs/DA - MotoRev v2.docx
@@ -10,7 +10,6 @@
           <w:docPartUnique/>
         </w:docPartObj>
       </w:sdtPr>
-      <w:sdtEndPr/>
       <w:sdtContent>
         <w:p>
           <w:r>
@@ -523,7 +522,6 @@
                                   <w:dataBinding w:prefixMappings="xmlns:ns0='http://schemas.openxmlformats.org/package/2006/metadata/core-properties' xmlns:ns1='http://purl.org/dc/elements/1.1/'" w:xpath="/ns0:coreProperties[1]/ns1:title[1]" w:storeItemID="{6C3C8BC8-F283-45AE-878A-BAB7291924A1}"/>
                                   <w:text/>
                                 </w:sdtPr>
-                                <w:sdtEndPr/>
                                 <w:sdtContent>
                                   <w:p>
                                     <w:pPr>
@@ -559,7 +557,6 @@
                                   <w:dataBinding w:prefixMappings="xmlns:ns0='http://schemas.openxmlformats.org/package/2006/metadata/core-properties' xmlns:ns1='http://purl.org/dc/elements/1.1/'" w:xpath="/ns0:coreProperties[1]/ns1:subject[1]" w:storeItemID="{6C3C8BC8-F283-45AE-878A-BAB7291924A1}"/>
                                   <w:text/>
                                 </w:sdtPr>
-                                <w:sdtEndPr/>
                                 <w:sdtContent>
                                   <w:p>
                                     <w:pPr>
@@ -757,7 +754,6 @@
                                     <w:dataBinding w:prefixMappings="xmlns:ns0='http://schemas.openxmlformats.org/package/2006/metadata/core-properties' xmlns:ns1='http://purl.org/dc/elements/1.1/'" w:xpath="/ns0:coreProperties[1]/ns1:creator[1]" w:storeItemID="{6C3C8BC8-F283-45AE-878A-BAB7291924A1}"/>
                                     <w:text/>
                                   </w:sdtPr>
-                                  <w:sdtEndPr/>
                                   <w:sdtContent>
                                     <w:r>
                                       <w:rPr>
@@ -793,13 +789,7 @@
                                   <w:rPr>
                                     <w:color w:val="0E2841" w:themeColor="text2"/>
                                   </w:rPr>
-                                  <w:t xml:space="preserve">Richard </w:t>
-                                </w:r>
-                                <w:r>
-                                  <w:rPr>
-                                    <w:color w:val="0E2841" w:themeColor="text2"/>
-                                  </w:rPr>
-                                  <w:t>Mickaell</w:t>
+                                  <w:t>Richard Mickaell</w:t>
                                 </w:r>
                               </w:p>
                             </w:txbxContent>
@@ -5016,47 +5006,33 @@
     <w:p>
       <w:pPr>
         <w:pStyle w:val="Ttulo2"/>
-        <w:rPr>
-          <w:lang w:val="en-US"/>
-        </w:rPr>
       </w:pPr>
       <w:r>
-        <w:rPr>
-          <w:lang w:val="en-US"/>
-        </w:rPr>
-        <w:t>Spri</w:t>
+        <w:t>Sprint 1</w:t>
+      </w:r>
+    </w:p>
+    <w:p>
+      <w:pPr>
+        <w:spacing w:after="0" w:line="240" w:lineRule="auto"/>
+      </w:pPr>
+      <w:r>
+        <w:fldChar w:fldCharType="begin"/>
+      </w:r>
+      <w:r>
+        <w:instrText>HYPERLINK "https://github.com/rdsalvesPUC/motorev/issues/30"</w:instrText>
+      </w:r>
+      <w:r>
+        <w:fldChar w:fldCharType="separate"/>
       </w:r>
       <w:r>
         <w:rPr>
-          <w:lang w:val="en-US"/>
+          <w:rStyle w:val="Hyperlink"/>
         </w:rPr>
-        <w:t>nt 1</w:t>
+        <w:t>[EPIC] Documentação e Rubricas</w:t>
       </w:r>
-    </w:p>
-    <w:p>
-      <w:pPr>
-        <w:spacing w:after="0" w:line="240" w:lineRule="auto"/>
-      </w:pPr>
-      <w:hyperlink r:id="rId8" w:history="1">
-        <w:r>
-          <w:rPr>
-            <w:rStyle w:val="Hyperlink"/>
-          </w:rPr>
-          <w:t>[EPIC] Documen</w:t>
-        </w:r>
-        <w:r>
-          <w:rPr>
-            <w:rStyle w:val="Hyperlink"/>
-          </w:rPr>
-          <w:t>t</w:t>
-        </w:r>
-        <w:r>
-          <w:rPr>
-            <w:rStyle w:val="Hyperlink"/>
-          </w:rPr>
-          <w:t>ação e Rubricas</w:t>
-        </w:r>
-      </w:hyperlink>
+      <w:r>
+        <w:fldChar w:fldCharType="end"/>
+      </w:r>
     </w:p>
     <w:tbl>
       <w:tblPr>
@@ -5088,7 +5064,7 @@
               <w:spacing w:after="0" w:line="240" w:lineRule="auto"/>
               <w:ind w:left="288"/>
             </w:pPr>
-            <w:hyperlink r:id="rId9" w:history="1">
+            <w:hyperlink r:id="rId8" w:history="1">
               <w:r>
                 <w:rPr>
                   <w:rStyle w:val="Hyperlink"/>
@@ -5117,7 +5093,7 @@
                 <w:lang w:val="en-US"/>
               </w:rPr>
             </w:pPr>
-            <w:hyperlink r:id="rId10" w:history="1">
+            <w:hyperlink r:id="rId9" w:history="1">
               <w:r>
                 <w:rPr>
                   <w:rStyle w:val="Hyperlink"/>
@@ -5172,7 +5148,7 @@
                 <w:lang w:val="en-US"/>
               </w:rPr>
             </w:pPr>
-            <w:hyperlink r:id="rId11" w:history="1">
+            <w:hyperlink r:id="rId10" w:history="1">
               <w:r>
                 <w:rPr>
                   <w:rStyle w:val="Hyperlink"/>
@@ -5211,7 +5187,7 @@
                 <w:lang w:val="en-US"/>
               </w:rPr>
             </w:pPr>
-            <w:hyperlink r:id="rId12" w:history="1">
+            <w:hyperlink r:id="rId11" w:history="1">
               <w:r>
                 <w:rPr>
                   <w:rStyle w:val="Hyperlink"/>
@@ -5257,7 +5233,7 @@
                 <w:lang w:val="en-US"/>
               </w:rPr>
             </w:pPr>
-            <w:hyperlink r:id="rId13" w:history="1">
+            <w:hyperlink r:id="rId12" w:history="1">
               <w:r>
                 <w:rPr>
                   <w:rStyle w:val="Hyperlink"/>
@@ -5288,7 +5264,7 @@
       <w:pPr>
         <w:spacing w:after="0" w:line="240" w:lineRule="auto"/>
       </w:pPr>
-      <w:hyperlink r:id="rId14" w:history="1">
+      <w:hyperlink r:id="rId13" w:history="1">
         <w:r>
           <w:rPr>
             <w:rStyle w:val="Hyperlink"/>
@@ -5327,7 +5303,7 @@
               <w:spacing w:after="0" w:line="240" w:lineRule="auto"/>
               <w:ind w:left="288"/>
             </w:pPr>
-            <w:hyperlink r:id="rId15" w:history="1">
+            <w:hyperlink r:id="rId14" w:history="1">
               <w:r>
                 <w:rPr>
                   <w:rStyle w:val="Hyperlink"/>
@@ -5367,7 +5343,7 @@
               <w:spacing w:after="0" w:line="240" w:lineRule="auto"/>
               <w:ind w:left="288"/>
             </w:pPr>
-            <w:hyperlink r:id="rId16" w:history="1">
+            <w:hyperlink r:id="rId15" w:history="1">
               <w:r>
                 <w:rPr>
                   <w:rStyle w:val="Hyperlink"/>
@@ -5407,7 +5383,7 @@
               <w:spacing w:after="0" w:line="240" w:lineRule="auto"/>
               <w:ind w:left="288"/>
             </w:pPr>
-            <w:hyperlink r:id="rId17" w:history="1">
+            <w:hyperlink r:id="rId16" w:history="1">
               <w:r>
                 <w:rPr>
                   <w:rStyle w:val="Hyperlink"/>
@@ -5447,7 +5423,7 @@
               <w:spacing w:after="0" w:line="240" w:lineRule="auto"/>
               <w:ind w:left="288"/>
             </w:pPr>
-            <w:hyperlink r:id="rId18" w:history="1">
+            <w:hyperlink r:id="rId17" w:history="1">
               <w:r>
                 <w:rPr>
                   <w:rStyle w:val="Hyperlink"/>
@@ -5487,7 +5463,7 @@
               <w:spacing w:after="0" w:line="240" w:lineRule="auto"/>
               <w:ind w:left="288"/>
             </w:pPr>
-            <w:hyperlink r:id="rId19" w:history="1">
+            <w:hyperlink r:id="rId18" w:history="1">
               <w:r>
                 <w:rPr>
                   <w:rStyle w:val="Hyperlink"/>
@@ -5527,7 +5503,7 @@
               <w:spacing w:after="0" w:line="240" w:lineRule="auto"/>
               <w:ind w:left="288"/>
             </w:pPr>
-            <w:hyperlink r:id="rId20" w:history="1">
+            <w:hyperlink r:id="rId19" w:history="1">
               <w:r>
                 <w:rPr>
                   <w:rStyle w:val="Hyperlink"/>
@@ -5562,7 +5538,7 @@
       <w:pPr>
         <w:spacing w:after="0" w:line="240" w:lineRule="auto"/>
       </w:pPr>
-      <w:hyperlink r:id="rId21" w:history="1">
+      <w:hyperlink r:id="rId20" w:history="1">
         <w:r>
           <w:rPr>
             <w:rStyle w:val="Hyperlink"/>
@@ -5601,7 +5577,7 @@
               <w:spacing w:after="0" w:line="240" w:lineRule="auto"/>
               <w:ind w:left="288"/>
             </w:pPr>
-            <w:hyperlink r:id="rId22" w:history="1">
+            <w:hyperlink r:id="rId21" w:history="1">
               <w:r>
                 <w:rPr>
                   <w:rStyle w:val="Hyperlink"/>
@@ -5641,7 +5617,7 @@
               <w:spacing w:after="0" w:line="240" w:lineRule="auto"/>
               <w:ind w:left="288"/>
             </w:pPr>
-            <w:hyperlink r:id="rId23" w:history="1">
+            <w:hyperlink r:id="rId22" w:history="1">
               <w:r>
                 <w:rPr>
                   <w:rStyle w:val="Hyperlink"/>
@@ -5661,6 +5637,46 @@
                   <w:rStyle w:val="Hyperlink"/>
                 </w:rPr>
                 <w:t xml:space="preserve"> modelos de moto</w:t>
+              </w:r>
+            </w:hyperlink>
+          </w:p>
+        </w:tc>
+      </w:tr>
+      <w:tr>
+        <w:trPr>
+          <w:tblCellSpacing w:w="15" w:type="dxa"/>
+        </w:trPr>
+        <w:tc>
+          <w:tcPr>
+            <w:tcW w:w="0" w:type="auto"/>
+            <w:vAlign w:val="center"/>
+            <w:hideMark/>
+          </w:tcPr>
+          <w:p>
+            <w:pPr>
+              <w:spacing w:after="0" w:line="240" w:lineRule="auto"/>
+              <w:ind w:left="288"/>
+            </w:pPr>
+            <w:hyperlink r:id="rId23" w:history="1">
+              <w:r>
+                <w:rPr>
+                  <w:rStyle w:val="Hyperlink"/>
+                </w:rPr>
+                <w:t>[US</w:t>
+              </w:r>
+              <w:proofErr w:type="gramStart"/>
+              <w:r>
+                <w:rPr>
+                  <w:rStyle w:val="Hyperlink"/>
+                </w:rPr>
+                <w:t>] Atualizar</w:t>
+              </w:r>
+              <w:proofErr w:type="gramEnd"/>
+              <w:r>
+                <w:rPr>
+                  <w:rStyle w:val="Hyperlink"/>
+                </w:rPr>
+                <w:t xml:space="preserve"> modelo de moto</w:t>
               </w:r>
             </w:hyperlink>
           </w:p>
@@ -5733,7 +5749,7 @@
                 <w:rPr>
                   <w:rStyle w:val="Hyperlink"/>
                 </w:rPr>
-                <w:t>] Atualizar</w:t>
+                <w:t>] Inativar</w:t>
               </w:r>
               <w:proofErr w:type="gramEnd"/>
               <w:r>
@@ -5773,46 +5789,6 @@
                 <w:rPr>
                   <w:rStyle w:val="Hyperlink"/>
                 </w:rPr>
-                <w:t>] Inativar</w:t>
-              </w:r>
-              <w:proofErr w:type="gramEnd"/>
-              <w:r>
-                <w:rPr>
-                  <w:rStyle w:val="Hyperlink"/>
-                </w:rPr>
-                <w:t xml:space="preserve"> modelo de moto</w:t>
-              </w:r>
-            </w:hyperlink>
-          </w:p>
-        </w:tc>
-      </w:tr>
-      <w:tr>
-        <w:trPr>
-          <w:tblCellSpacing w:w="15" w:type="dxa"/>
-        </w:trPr>
-        <w:tc>
-          <w:tcPr>
-            <w:tcW w:w="0" w:type="auto"/>
-            <w:vAlign w:val="center"/>
-            <w:hideMark/>
-          </w:tcPr>
-          <w:p>
-            <w:pPr>
-              <w:spacing w:after="0" w:line="240" w:lineRule="auto"/>
-              <w:ind w:left="288"/>
-            </w:pPr>
-            <w:hyperlink r:id="rId27" w:history="1">
-              <w:r>
-                <w:rPr>
-                  <w:rStyle w:val="Hyperlink"/>
-                </w:rPr>
-                <w:t>[US</w:t>
-              </w:r>
-              <w:proofErr w:type="gramStart"/>
-              <w:r>
-                <w:rPr>
-                  <w:rStyle w:val="Hyperlink"/>
-                </w:rPr>
                 <w:t>] Consultar</w:t>
               </w:r>
               <w:proofErr w:type="gramEnd"/>
@@ -5836,7 +5812,7 @@
       <w:pPr>
         <w:spacing w:after="0" w:line="240" w:lineRule="auto"/>
       </w:pPr>
-      <w:hyperlink r:id="rId28" w:history="1">
+      <w:hyperlink r:id="rId27" w:history="1">
         <w:r>
           <w:rPr>
             <w:rStyle w:val="Hyperlink"/>
@@ -5904,7 +5880,7 @@
                 <w:lang w:val="en-US"/>
               </w:rPr>
             </w:pPr>
-            <w:hyperlink r:id="rId29" w:history="1">
+            <w:hyperlink r:id="rId28" w:history="1">
               <w:r>
                 <w:rPr>
                   <w:rStyle w:val="Hyperlink"/>
@@ -5959,7 +5935,7 @@
                 <w:lang w:val="en-US"/>
               </w:rPr>
             </w:pPr>
-            <w:hyperlink r:id="rId30" w:history="1">
+            <w:hyperlink r:id="rId29" w:history="1">
               <w:r>
                 <w:rPr>
                   <w:rStyle w:val="Hyperlink"/>
@@ -6014,7 +5990,7 @@
                 <w:lang w:val="en-US"/>
               </w:rPr>
             </w:pPr>
-            <w:hyperlink r:id="rId31" w:history="1">
+            <w:hyperlink r:id="rId30" w:history="1">
               <w:r>
                 <w:rPr>
                   <w:rStyle w:val="Hyperlink"/>
@@ -6069,7 +6045,7 @@
                 <w:lang w:val="en-US"/>
               </w:rPr>
             </w:pPr>
-            <w:hyperlink r:id="rId32" w:history="1">
+            <w:hyperlink r:id="rId31" w:history="1">
               <w:r>
                 <w:rPr>
                   <w:rStyle w:val="Hyperlink"/>
@@ -6121,7 +6097,7 @@
               <w:spacing w:after="0" w:line="240" w:lineRule="auto"/>
               <w:ind w:left="288"/>
             </w:pPr>
-            <w:hyperlink r:id="rId33" w:history="1">
+            <w:hyperlink r:id="rId32" w:history="1">
               <w:r>
                 <w:rPr>
                   <w:rStyle w:val="Hyperlink"/>
@@ -6181,13 +6157,7 @@
         <w:rPr>
           <w:lang w:val="en-US"/>
         </w:rPr>
-        <w:t xml:space="preserve">nt </w:t>
-      </w:r>
-      <w:r>
-        <w:rPr>
-          <w:lang w:val="en-US"/>
-        </w:rPr>
-        <w:t>2</w:t>
+        <w:t>nt 2</w:t>
       </w:r>
     </w:p>
     <w:tbl>
@@ -6222,7 +6192,7 @@
                 <w:lang w:val="en-US"/>
               </w:rPr>
             </w:pPr>
-            <w:hyperlink r:id="rId34" w:history="1">
+            <w:hyperlink r:id="rId33" w:history="1">
               <w:r>
                 <w:rPr>
                   <w:rStyle w:val="Hyperlink"/>
@@ -6260,7 +6230,7 @@
                 <w:lang w:val="en-US"/>
               </w:rPr>
             </w:pPr>
-            <w:hyperlink r:id="rId35" w:history="1">
+            <w:hyperlink r:id="rId34" w:history="1">
               <w:r>
                 <w:rPr>
                   <w:rStyle w:val="Hyperlink"/>
@@ -6298,7 +6268,7 @@
                 <w:lang w:val="en-US"/>
               </w:rPr>
             </w:pPr>
-            <w:hyperlink r:id="rId36" w:history="1">
+            <w:hyperlink r:id="rId35" w:history="1">
               <w:r>
                 <w:rPr>
                   <w:rStyle w:val="Hyperlink"/>
@@ -6344,13 +6314,7 @@
         <w:rPr>
           <w:lang w:val="en-US"/>
         </w:rPr>
-        <w:t xml:space="preserve">nt </w:t>
-      </w:r>
-      <w:r>
-        <w:rPr>
-          <w:lang w:val="en-US"/>
-        </w:rPr>
-        <w:t>3</w:t>
+        <w:t>nt 3</w:t>
       </w:r>
     </w:p>
     <w:tbl>
@@ -6385,7 +6349,7 @@
                 <w:lang w:val="en-US"/>
               </w:rPr>
             </w:pPr>
-            <w:hyperlink r:id="rId37" w:history="1">
+            <w:hyperlink r:id="rId36" w:history="1">
               <w:r>
                 <w:rPr>
                   <w:rStyle w:val="Hyperlink"/>
@@ -6414,7 +6378,7 @@
                 <w:lang w:val="en-US"/>
               </w:rPr>
             </w:pPr>
-            <w:hyperlink r:id="rId38" w:history="1">
+            <w:hyperlink r:id="rId37" w:history="1">
               <w:r>
                 <w:rPr>
                   <w:rStyle w:val="Hyperlink"/>
@@ -6468,7 +6432,7 @@
                 <w:lang w:val="en-US"/>
               </w:rPr>
             </w:pPr>
-            <w:hyperlink r:id="rId39" w:history="1">
+            <w:hyperlink r:id="rId38" w:history="1">
               <w:r>
                 <w:rPr>
                   <w:rStyle w:val="Hyperlink"/>
@@ -6519,7 +6483,7 @@
                       <w:lang w:val="en-US"/>
                     </w:rPr>
                   </w:pPr>
-                  <w:hyperlink r:id="rId40" w:history="1">
+                  <w:hyperlink r:id="rId39" w:history="1">
                     <w:r>
                       <w:rPr>
                         <w:rStyle w:val="Hyperlink"/>
@@ -6544,7 +6508,7 @@
                   <w:pPr>
                     <w:spacing w:after="0"/>
                   </w:pPr>
-                  <w:hyperlink r:id="rId41" w:history="1">
+                  <w:hyperlink r:id="rId40" w:history="1">
                     <w:r>
                       <w:rPr>
                         <w:rStyle w:val="Hyperlink"/>
@@ -6581,13 +6545,7 @@
         <w:rPr>
           <w:lang w:val="en-US"/>
         </w:rPr>
-        <w:t xml:space="preserve">nt </w:t>
-      </w:r>
-      <w:r>
-        <w:rPr>
-          <w:lang w:val="en-US"/>
-        </w:rPr>
-        <w:t>4</w:t>
+        <w:t>nt 4</w:t>
       </w:r>
     </w:p>
     <w:tbl>
@@ -6622,7 +6580,7 @@
                 <w:lang w:val="en-US"/>
               </w:rPr>
             </w:pPr>
-            <w:hyperlink r:id="rId42" w:history="1">
+            <w:hyperlink r:id="rId41" w:history="1">
               <w:r>
                 <w:rPr>
                   <w:rStyle w:val="Hyperlink"/>
@@ -6660,7 +6618,7 @@
                 <w:lang w:val="en-US"/>
               </w:rPr>
             </w:pPr>
-            <w:hyperlink r:id="rId43" w:history="1">
+            <w:hyperlink r:id="rId42" w:history="1">
               <w:r>
                 <w:rPr>
                   <w:rStyle w:val="Hyperlink"/>
@@ -6714,7 +6672,7 @@
                 <w:lang w:val="en-US"/>
               </w:rPr>
             </w:pPr>
-            <w:hyperlink r:id="rId44" w:history="1">
+            <w:hyperlink r:id="rId43" w:history="1">
               <w:r>
                 <w:rPr>
                   <w:rStyle w:val="Hyperlink"/>
@@ -6743,7 +6701,7 @@
                 <w:lang w:val="en-US"/>
               </w:rPr>
             </w:pPr>
-            <w:hyperlink r:id="rId45" w:history="1">
+            <w:hyperlink r:id="rId44" w:history="1">
               <w:r>
                 <w:rPr>
                   <w:rStyle w:val="Hyperlink"/>
@@ -6782,13 +6740,7 @@
         <w:rPr>
           <w:lang w:val="en-US"/>
         </w:rPr>
-        <w:t xml:space="preserve">nt </w:t>
-      </w:r>
-      <w:r>
-        <w:rPr>
-          <w:lang w:val="en-US"/>
-        </w:rPr>
-        <w:t>5</w:t>
+        <w:t>nt 5</w:t>
       </w:r>
     </w:p>
     <w:p>
@@ -6798,7 +6750,7 @@
           <w:lang w:val="en-US"/>
         </w:rPr>
       </w:pPr>
-      <w:hyperlink r:id="rId46" w:history="1">
+      <w:hyperlink r:id="rId45" w:history="1">
         <w:r>
           <w:rPr>
             <w:rStyle w:val="Hyperlink"/>
@@ -6865,7 +6817,7 @@
                 <w:lang w:val="en-US"/>
               </w:rPr>
             </w:pPr>
-            <w:hyperlink r:id="rId47" w:history="1">
+            <w:hyperlink r:id="rId46" w:history="1">
               <w:r>
                 <w:rPr>
                   <w:rStyle w:val="Hyperlink"/>
@@ -6903,7 +6855,7 @@
                 <w:lang w:val="en-US"/>
               </w:rPr>
             </w:pPr>
-            <w:hyperlink r:id="rId48" w:history="1">
+            <w:hyperlink r:id="rId47" w:history="1">
               <w:r>
                 <w:rPr>
                   <w:rStyle w:val="Hyperlink"/>
@@ -6964,7 +6916,7 @@
                 <w:lang w:val="en-US"/>
               </w:rPr>
             </w:pPr>
-            <w:hyperlink r:id="rId49" w:history="1">
+            <w:hyperlink r:id="rId48" w:history="1">
               <w:r>
                 <w:rPr>
                   <w:rStyle w:val="Hyperlink"/>
@@ -7135,7 +7087,7 @@
       </w:pPr>
     </w:p>
     <w:sectPr>
-      <w:headerReference w:type="default" r:id="rId50"/>
+      <w:headerReference w:type="default" r:id="rId49"/>
       <w:pgSz w:w="12240" w:h="15840"/>
       <w:pgMar w:top="720" w:right="720" w:bottom="720" w:left="720" w:header="720" w:footer="720" w:gutter="0"/>
       <w:cols w:space="720"/>
@@ -11257,6 +11209,7 @@
   <w:style w:type="character" w:default="1" w:styleId="Fontepargpadro">
     <w:name w:val="Default Paragraph Font"/>
     <w:uiPriority w:val="1"/>
+    <w:semiHidden/>
     <w:unhideWhenUsed/>
   </w:style>
   <w:style w:type="table" w:default="1" w:styleId="Tabelanormal">

</xml_diff>